<commit_message>
Paid first on hubs and /all/, All jobs nav, five small-business products live
</commit_message>
<xml_diff>
--- a/downloads/freelance-freelance-quote-template.docx
+++ b/downloads/freelance-freelance-quote-template.docx
@@ -1072,6 +1072,42 @@
           <w:sz w:val="18"/>
         </w:rPr>
         <w:t xml:space="preserve">More free pages: https://proskillpacks.github.io/freelance/</w:t>
+      </w:r>
+    </w:p>
+    <w:p>
+      <w:pPr>
+        <w:spacing w:after="120"/>
+      </w:pPr>
+      <w:r>
+        <w:rPr>
+          <w:color w:val="666666"/>
+          <w:sz w:val="18"/>
+        </w:rPr>
+        <w:t xml:space="preserve">The full version: Quote and Estimate Builder. Give it a job and your rate card. Get an itemised quote with exact totals from a script; anything unpriced is marked PRICE NEEDED.</w:t>
+      </w:r>
+    </w:p>
+    <w:p>
+      <w:pPr>
+        <w:spacing w:after="120"/>
+      </w:pPr>
+      <w:r>
+        <w:rPr>
+          <w:color w:val="666666"/>
+          <w:sz w:val="18"/>
+        </w:rPr>
+        <w:t xml:space="preserve">$9, one price. Half price for the first 10 buyers with code FIRST10. 30-day refund.</w:t>
+      </w:r>
+    </w:p>
+    <w:p>
+      <w:pPr>
+        <w:spacing w:after="120"/>
+      </w:pPr>
+      <w:r>
+        <w:rPr>
+          <w:color w:val="666666"/>
+          <w:sz w:val="18"/>
+        </w:rPr>
+        <w:t xml:space="preserve">More about it: https://proskillpacks.github.io/skills/quote-and-estimate-builder/</w:t>
       </w:r>
     </w:p>
     <w:sectPr>

</xml_diff>